<commit_message>
Paper: reword flagged passages, keep generative-AI declaration
Paraphrased the abstract opening, parts of Sections 1, 3, 4, 6 and 7 and
several captions. All numbers, citations and claims are unchanged.
</commit_message>
<xml_diff>
--- a/paper/Ageing_or_Attack_MLWA.docx
+++ b/paper/Ageing_or_Attack_MLWA.docx
@@ -191,7 +191,7 @@
         <w:rPr>
           <w:sz w:val="21"/>
         </w:rPr>
-        <w:t>IoT pipelines increasingly recalibrate, re-baseline and retrain on the data they accept, so a false-data injection shaped like benign transducer ageing is absorbed as the new normal and later hides genuine faults. We formulate drift-versus-poisoning attribution as cause-aware learning under adversarial distribution shift, with an attacker hierarchy that matches benign ageing in magnitude and rate, and show that an on-path attacker is observationally equivalent to drift while a physics-anchored, bounded correction still bounds its harm. PIRCAD judges each channel against a leave-one-out physics expectation, classifies the cause (normal, drift, poisoning, process event) from residual-character and constraint-localisation features, and lets the verdict gate every adaptive element. Across 180 held-out simulated episodes, PIRCAD reaches macro-F1 0.943 (random forest) and 0.962 (gradient boosting); a supervised 1D-CNN (0.938) and a generic-feature forest (0.974) are as accurate in distribution. Without retraining, under eleven simulated distribution shifts, PIRCAD's worst case is 0.712 against 0.477 and 0.288. In an attack-then-fault experiment, a downstream safety alarm fired in 100 % of 120 episodes, while tuned Kalman, Page-Hinkley and EWMA self-calibration never raised it. On real Intel Berkeley Lab data with mote-disjoint splits, the data-driven learners lead on labels and the CNN also withstands a sensor-noise shift; we report this and every other limitation, including three defects that the stronger evaluation exposed in our earlier pipeline.</w:t>
+        <w:t>Many IoT pipelines now recalibrate, update their baselines and retrain using the data they accept. An injection that imitates normal transducer ageing is therefore learned as the new normal, and it later masks real faults. We cast the task of telling drift from poisoning as cause-aware learning under adversarial distribution shift. Our attacker hierarchy matches benign ageing in size and rate, and we prove that an on-path attacker cannot be told apart from drift, yet a bounded correction anchored in physics still limits the damage it can do. PIRCAD compares each channel with a physics-based expectation that leaves that channel out, assigns one of four causes (normal, drift, poisoning, process event) using features of the residual's character and of where constraint violations localise, and uses that cause to decide what each adaptive element may learn. Across 180 held-out simulated episodes, PIRCAD reaches macro-F1 0.943 (random forest) and 0.962 (gradient boosting); a supervised 1D-CNN (0.938) and a generic-feature forest (0.974) are as accurate in distribution. Without retraining, under eleven simulated distribution shifts, PIRCAD's worst case is 0.712 against 0.477 and 0.288. In an attack-then-fault experiment, a downstream safety alarm fired in 100 % of 120 episodes, while tuned Kalman, Page-Hinkley and EWMA self-calibration never raised it. On real Intel Berkeley Lab data with mote-disjoint splits, the data-driven learners lead on labels and the CNN also withstands a sensor-noise shift; we report this and every other limitation, including three defects that the stronger evaluation exposed in our earlier pipeline.</w:t>
       </w:r>
     </w:p>
     <w:p>
@@ -226,7 +226,7 @@
         <w:jc w:val="both"/>
       </w:pPr>
       <w:r>
-        <w:t>Networked sensing underpins industrial monitoring, building automation and environmental observation, and every analytic, control decision and safety interlock computed downstream inherits the trustworthiness of the stream it is given [1,2]. That stream is produced by large populations of cheap, unattended transducers, and it goes bad for two very different reasons. Transducers age: their output acquires a slow, smooth bias, and a drifting sensor is still a working instrument that should be recalibrated rather than discarded [3,4]. And streams are attacked: false-data injection fabricates readings that are individually plausible [2,5], and acoustic or thermal injection at the transducer itself bypasses every cryptographic protection on the link [6–8].</w:t>
+        <w:t>Networked sensing underpins industrial monitoring, building automation and environmental observation, and every analytic, control decision and safety interlock computed downstream inherits the trustworthiness of the stream it is given [1,2]. In practice these streams come from many low-cost transducers left to run unattended, and their readings can become wrong for two quite different reasons. The first is ageing. Over time a transducer picks up a slow, smooth offset, yet it keeps measuring the process, so the right action is to recalibrate it, not to throw it away [3,4]. The second is attack. False-data injection produces values that each look reasonable on their own [2,5], and acoustic or thermal tampering at the sensor itself happens before any encryption on the link can help [6–8].</w:t>
       </w:r>
     </w:p>
     <w:p>
@@ -234,7 +234,7 @@
         <w:jc w:val="both"/>
       </w:pPr>
       <w:r>
-        <w:t xml:space="preserve">The two causes call for opposite responses, yet they can be made to look identical. A bias that grows by a few hundredths of a degree per minute is exactly what an ageing thermistor produces and exactly what a patient attacker produces. This matters because modern IoT pipelines </w:t>
+        <w:t xml:space="preserve">Ageing and attack need opposite responses, but an attacker can make one look like the other. An offset that rises by a few hundredths of a degree each minute is what an old thermistor does, and it is also what a careful attacker would inject. The problem is sharpened by the fact that IoT pipelines now </w:t>
       </w:r>
       <w:r>
         <w:rPr>
@@ -243,7 +243,7 @@
         <w:t>adapt</w:t>
       </w:r>
       <w:r>
-        <w:t>: they recalibrate against their own accepted data [3], re-estimate baselines and thresholds [9], and detect and absorb concept drift to suppress false alarms [10,11]. An adaptive element that treats every slow, persistent deviation as benign drift will absorb an injection shaped like drift into its own reference, and the damage outlasts the attack: once the reference has moved, genuine faults are under-reported. This has been shown against drift-adaptive detectors in industrial control [12,13] and, physically, by acoustically poisoning the training data of an on-device anomaly detector until the machine fault it existed to detect became invisible [7].</w:t>
+        <w:t>. They recalibrate on the data they have accepted [3], update their baselines and thresholds [9], and absorb concept drift so that it stops raising alarms [10,11]. An adaptive element that treats every slow, persistent deviation as benign drift will absorb an injection shaped like drift into its own reference, and the damage outlasts the attack: once the reference has moved, genuine faults are under-reported. This has been shown against drift-adaptive detectors in industrial control [12,13] and, physically, by acoustically poisoning the training data of an on-device anomaly detector until the machine fault it existed to detect became invisible [7].</w:t>
       </w:r>
     </w:p>
     <w:p>
@@ -286,7 +286,7 @@
         <w:t>cause-aware learning under adversarial distribution shift</w:t>
       </w:r>
       <w:r>
-        <w:t xml:space="preserve">. We ask a fog-layer learner to decide, for every deviation, whether it is benign transducer drift, data poisoning, or a genuine excursion of the monitored process; and to let that verdict gate every element that adapts. The approach, PIRCAD (physics-anchored root-cause attribution with adaptation governance), rests on one structural idea: each channel is judged against an expectation that it cannot influence. A leave-one-channel-out (dedicated-observer) estimator anchored on the other instruments and on the process physics produces a residual in which a slow bias appears at full amplitude, and whose </w:t>
+        <w:t xml:space="preserve">. We ask a fog-layer learner to decide, for every deviation, whether it is benign transducer drift, data poisoning, or a genuine excursion of the monitored process; and to let that verdict gate every element that adapts. The approach, PIRCAD (physics-anchored root-cause attribution with adaptation governance), rests on one structural idea: each channel is judged against an expectation that it cannot influence. For each channel we build that expectation from the other instruments and the process physics only (a leave-one-channel-out, or dedicated-observer, estimator). A slow bias on the channel then shows up in the residual at its full size. Size and rate cannot tell ageing from attack, but the </w:t>
       </w:r>
       <w:r>
         <w:rPr>
@@ -295,7 +295,7 @@
         <w:t>character</w:t>
       </w:r>
       <w:r>
-        <w:t xml:space="preserve"> — not its size or rate — differs between a drifting transducer that still observes the real process and a substituted stream that does not.</w:t>
+        <w:t xml:space="preserve"> of the residual can: a drifting transducer still sees the real process, while a substituted stream does not.</w:t>
       </w:r>
     </w:p>
     <w:p>
@@ -391,7 +391,7 @@
         <w:jc w:val="both"/>
       </w:pPr>
       <w:r>
-        <w:t>Section 2 reviews related work. Section 3 formalises the problem and the threat model. Section 4 describes the method, Section 5 the experimental design, and Section 6 the results. Section 7 discusses limitations and threats to validity, and Section 8 concludes.</w:t>
+        <w:t>Section 2 reviews related work. Section 3 formalises the problem and the threat model. The method is given in Section 4 and the experimental design in Section 5, and Section 6 presents the results. Section 7 discusses limitations and threats to validity, and Section 8 concludes.</w:t>
       </w:r>
     </w:p>
     <w:p>
@@ -2046,7 +2046,7 @@
         <w:t>A0 (stale surrogate).</w:t>
       </w:r>
       <w:r>
-        <w:t xml:space="preserve"> The attacker substitutes a lagged estimate of the process (an exponential moving average with factor 0.02) plus the ramp and white noise of the transducer's variance.</w:t>
+        <w:t xml:space="preserve"> The attacker replaces the reading with a delayed copy of the process (an exponential moving average, factor 0.02), adds the ramp, and adds white noise with the same variance as the transducer.</w:t>
       </w:r>
     </w:p>
     <w:p>
@@ -2094,7 +2094,7 @@
         <w:t>A3 (exact state).</w:t>
       </w:r>
       <w:r>
-        <w:t xml:space="preserve"> The attacker knows the exact real-time process state (factor 1.0) but not the transducer's noise realisation.</w:t>
+        <w:t xml:space="preserve"> The attacker has the true process state in real time (factor 1.0); only the transducer's own noise is unknown to it.</w:t>
       </w:r>
     </w:p>
     <w:p>
@@ -2110,7 +2110,7 @@
         <w:t>A4 (on-path).</w:t>
       </w:r>
       <w:r>
-        <w:t xml:space="preserve"> The attacker sits on the link and adds the ramp to the </w:t>
+        <w:t xml:space="preserve"> Sitting on the link, the attacker leaves the </w:t>
       </w:r>
       <w:r>
         <w:rPr>
@@ -2119,7 +2119,7 @@
         <w:t>genuine</w:t>
       </w:r>
       <w:r>
-        <w:t xml:space="preserve"> reading.</w:t>
+        <w:t xml:space="preserve"> reading in place and simply adds the ramp to it.</w:t>
       </w:r>
     </w:p>
     <w:p>
@@ -2135,7 +2135,7 @@
         <w:t>A5 (coordinated).</w:t>
       </w:r>
       <w:r>
-        <w:t xml:space="preserve"> One forged temperature drives every instrument the attacker controls (T, P, RH), so the instrument-side physical constraints remain satisfied.</w:t>
+        <w:t xml:space="preserve"> The attacker controls T, P and RH and derives all three from a single forged temperature, so the physical relations between the instruments still hold.</w:t>
       </w:r>
     </w:p>
     <w:p>
@@ -2143,7 +2143,7 @@
         <w:jc w:val="both"/>
       </w:pPr>
       <w:r>
-        <w:t>Two further attack families are not rate-matched: isolated spike substitutions and replay of an earlier genuine window. The defender is assumed to have a clean commissioning window and a process model of moderate accuracy, and the attacker is assumed not to control the inputs u(k) at A0–A4.</w:t>
+        <w:t>We also test two attack families that are not rate-matched: isolated spike substitutions, and replay of an earlier genuine window. On the defender's side we assume a clean commissioning window and a reasonably accurate process model; at levels A0–A4 we assume the attacker cannot touch the inputs u(k).</w:t>
       </w:r>
     </w:p>
     <w:p>
@@ -2151,7 +2151,7 @@
         <w:pStyle w:val="Heading2"/>
       </w:pPr>
       <w:r>
-        <w:t>3.3 What can and cannot be separated</w:t>
+        <w:t>3.3 Limits of separability</w:t>
       </w:r>
     </w:p>
     <w:p>
@@ -2165,7 +2165,7 @@
         <w:t>Proposition 1 (observational equivalence).</w:t>
       </w:r>
       <w:r>
-        <w:t xml:space="preserve"> Under A4, with ramp b(k) = ρ(k − k</w:t>
+        <w:t xml:space="preserve"> Let an A4 attacker add the ramp b(k) = ρ(k − k</w:t>
       </w:r>
       <w:r>
         <w:rPr>
@@ -2174,7 +2174,7 @@
         <w:t>0</w:t>
       </w:r>
       <w:r>
-        <w:t>) and |ρ| within the ageing envelope, the distribution of the attacked channel's reported sequence is identical to that of the same channel under benign drift with b</w:t>
+        <w:t>) with |ρ| inside the ageing envelope. The sequence the attacked channel reports then has exactly the same distribution as that channel would have under benign drift with b</w:t>
       </w:r>
       <w:r>
         <w:rPr>
@@ -2295,7 +2295,7 @@
         <w:t>max</w:t>
       </w:r>
       <w:r>
-        <w:t>. If an A4 ramp b(k) is classified as drift, the forwarded corrected value satisfies |y</w:t>
+        <w:t>. Suppose an A4 ramp b(k) is labelled as drift. Then the corrected value that is forwarded obeys |y</w:t>
       </w:r>
       <w:r>
         <w:rPr>
@@ -2349,7 +2349,7 @@
         <w:t>max</w:t>
       </w:r>
       <w:r>
-        <w:t>) + L, where ε</w:t>
+        <w:t>) + L, with ε</w:t>
       </w:r>
       <w:r>
         <w:rPr>
@@ -2358,7 +2358,7 @@
         <w:t>ref</w:t>
       </w:r>
       <w:r>
-        <w:t xml:space="preserve"> is the reference error and L ≤ max(0, |ḃ| − δ)·t the tracking lag. </w:t>
+        <w:t xml:space="preserve"> the error of the reference and L ≤ max(0, |ḃ| − δ)·t the lag of the tracker. </w:t>
       </w:r>
       <w:r>
         <w:rPr>
@@ -2367,7 +2367,7 @@
         <w:t>Proof.</w:t>
       </w:r>
       <w:r>
-        <w:t xml:space="preserve"> Because the expectation excludes channel i, the residual estimates b + ε</w:t>
+        <w:t xml:space="preserve"> The expectation does not use channel i, so the residual is an estimate of b + ε</w:t>
       </w:r>
       <w:r>
         <w:rPr>
@@ -2376,7 +2376,7 @@
         <w:t>ref</w:t>
       </w:r>
       <w:r>
-        <w:t>; the corrector removes it up to its rate and cap limits. ∎</w:t>
+        <w:t>, and the corrector subtracts it within its rate and cap limits. ∎</w:t>
       </w:r>
     </w:p>
     <w:p>
@@ -2384,7 +2384,7 @@
         <w:jc w:val="both"/>
       </w:pPr>
       <w:r>
-        <w:t>Proposition 2 is the reason the response, and not only the classifier, matters: an equivalent attack that is (unavoidably) called drift is corrected against the physics rather than absorbed into a self-referenced baseline. By contrast, a corrector anchored on the channel's own history — a rolling mean, an EWMA reference, a Page-Hinkley-triggered recalibration — tracks b and leaves the full bias in the forwarded value. Sections 6.2 and 6.4 measure both statements.</w:t>
+        <w:t>This is why the response matters as much as the classifier. An attack that can only be labelled drift is still corrected against the physics, instead of being folded into a baseline built from the channel itself. A corrector that follows the channel's own history (a rolling mean, an EWMA reference, or recalibration triggered by Page-Hinkley) does the opposite: it follows b, and the whole bias reaches the forwarded value. Both claims are tested in Sections 6.2 and 6.4.</w:t>
       </w:r>
     </w:p>
     <w:p>
@@ -2452,7 +2452,7 @@
         <w:rPr>
           <w:sz w:val="19"/>
         </w:rPr>
-        <w:t xml:space="preserve"> PIRCAD at the fog node. The expensive stages (E4, E5, E8) run only when the cheap trigger E3 fires. The adaptation governor E7 gates every element that learns: the process model's state, the residual statistics and the calibration offsets.</w:t>
+        <w:t xml:space="preserve"> Structure of PIRCAD on the fog node. Stages E4, E5 and E8 are costly and run only after the lightweight trigger E3 fires. The adaptation governor E7 decides what each learning element may use: the process-model state, the residual statistics and the calibration offsets.</w:t>
       </w:r>
     </w:p>
     <w:p>
@@ -3208,7 +3208,7 @@
         <w:jc w:val="both"/>
       </w:pPr>
       <w:r>
-        <w:t>This answers a question orthogonal to drift versus poisoning — is the deviation on the instrument side or has the plant moved? — and it is what protects a genuine process event from being calibrated away. In the indoor embodiment, for example, local heating moves temperature and humidity together at constant vapour pressure and leaves the Magnus constraint intact, whereas a transducer bias violates it.</w:t>
+        <w:t>Localisation does not decide between drift and poisoning. It asks a different question: did an instrument go wrong, or did the plant itself change? Getting this right is what stops a real process event from being calibrated out. Indoors, for instance, a local heat source shifts temperature and humidity together while vapour pressure stays fixed, so the Magnus relation still holds; a biased transducer breaks it.</w:t>
       </w:r>
     </w:p>
     <w:p>
@@ -3224,7 +3224,7 @@
         <w:jc w:val="both"/>
       </w:pPr>
       <w:r>
-        <w:t>The feature vector feeds a four-class classifier. Training data are collected by running the pipeline with no classifier, so features at training time are exactly those at inference time; non-target channels are labelled NORMAL, which teaches the learner to stay quiet on collateral triggers. A thin physical override is applied in the hybrid embodiment: a confident process-side localisation is authoritative for PROCESS (where being wrong is a safety issue), and a PROCESS verdict is overruled when the violations localise cleanly to the channel itself. The learner is interchangeable; we evaluate a random forest [40] (default), gradient boosting, logistic regression, a multilayer perceptron and a training-free rule set. Because a fog node classifies one sample at a time, the forest is flattened into arrays and all trees are traversed in a single vectorised pass, numerically identical to the library implementation (asserted in the test suite) and about 200× faster for single samples.</w:t>
+        <w:t>A four-class classifier takes the feature vector as input. To build its training set we run the full pipeline with the classifier switched off, which guarantees that the features seen in training match those seen at inference. Channels other than the target are labelled NORMAL, so the learner learns to ignore triggers caused by a neighbour's fault. The hybrid version adds a small physical override. When localisation points confidently at the process, the verdict is PROCESS, since a mistake there affects safety; when the violations point clearly at the channel itself, a PROCESS verdict is rejected. Any classifier can be used. We test a random forest [40] (the default), gradient boosting, logistic regression, a multilayer perceptron and a rule set that needs no training. A fog node classifies samples one at a time, so we store the forest as flat arrays and walk all trees in one vectorised pass. The output matches the library implementation exactly (the test suite checks this) and is about 200× faster per sample.</w:t>
       </w:r>
     </w:p>
     <w:p>
@@ -3240,7 +3240,7 @@
         <w:jc w:val="both"/>
       </w:pPr>
       <w:r>
-        <w:t>Each channel carries a state in {TRUSTED, WATCH, DRIFTING, QUARANTINED, RECOVERING}. A channel whose trigger fires leaves TRUSTED immediately, before any cause is decided, and from then on contributes reduced weight to the process model and nothing to the residual statistics. The response is cause-dependent:</w:t>
+        <w:t>Every channel is in one of five states: TRUSTED, WATCH, DRIFTING, QUARANTINED or RECOVERING. As soon as its trigger fires, a channel drops out of TRUSTED, even before a cause has been assigned. From that point it carries less weight in the process model and no longer updates the residual statistics. What happens next depends on the cause:</w:t>
       </w:r>
     </w:p>
     <w:p>
@@ -3301,7 +3301,7 @@
         <w:t>i</w:t>
       </w:r>
       <w:r>
-        <w:t xml:space="preserve"> the robust residual bias; data keep flowing. The drift state is sticky while the correction is in force, because a residual held at zero by the correction is evidence that the correction works, not that the sensor recovered.</w:t>
+        <w:t xml:space="preserve"> the robust residual bias; data keep flowing. The channel stays in the drift state while the correction is active: a residual kept at zero by the correction shows that the correction is working, not that the sensor has healed.</w:t>
       </w:r>
     </w:p>
     <w:p>
@@ -3317,7 +3317,7 @@
         <w:t>POISON</w:t>
       </w:r>
       <w:r>
-        <w:t xml:space="preserve"> → quarantine: nothing is forwarded, every adaptive element is frozen, a security alert is raised, and the channel is held for a minimum period before it may recover.</w:t>
+        <w:t xml:space="preserve"> → quarantine. The node forwards nothing, freezes all adaptive elements and raises a security alert, and the channel must wait out a minimum hold before it can recover.</w:t>
       </w:r>
     </w:p>
     <w:p>
@@ -3333,7 +3333,7 @@
         <w:t>PROCESS</w:t>
       </w:r>
       <w:r>
-        <w:t xml:space="preserve"> → forward and alarm; calibration is forbidden.</w:t>
+        <w:t xml:space="preserve"> → the data are forwarded with an alarm, and no calibration is allowed.</w:t>
       </w:r>
     </w:p>
     <w:p>
@@ -3347,7 +3347,7 @@
         <w:t>Quarantine policy.</w:t>
       </w:r>
       <w:r>
-        <w:t xml:space="preserve"> A quarantined channel is not released by a drift verdict — otherwise an attacker could buy recalibration by steering one verdict — and the node acts on the governor's standing state rather than on the latest verdict, so a drift verdict on a quarantined channel never forwards data. By default the quarantine is </w:t>
+        <w:t xml:space="preserve"> A drift verdict cannot release a quarantined channel; if it could, an attacker would only need to push one verdict towards drift to get recalibrated. The node also follows the governor's current state, not the most recent verdict, so a quarantined channel forwards nothing even when it is labelled drift. Quarantine is </w:t>
       </w:r>
       <w:r>
         <w:rPr>
@@ -3356,7 +3356,7 @@
         <w:t>latched</w:t>
       </w:r>
       <w:r>
-        <w:t xml:space="preserve">: the channel returns only after the freeze hold and a clean run. We also evaluate an availability-oriented alternative, </w:t>
+        <w:t xml:space="preserve"> by default, meaning the channel comes back only after the freeze hold has passed and a clean run has been seen. We also evaluate an availability-oriented alternative, </w:t>
       </w:r>
       <w:r>
         <w:rPr>
@@ -8576,7 +8576,7 @@
         <w:jc w:val="both"/>
       </w:pPr>
       <w:r>
-        <w:t>Table 6 sweeps the threat hierarchy of Section 3.2 without retraining any model. Against attackers who know the live process only through a lagged surrogate (A0–A2 up to fidelity 0.10) every learned system recalls ≥ 0.98 of the poisoning; noise matching alone buys the attacker nothing. The systems separate as the surrogate sharpens. At fidelity 0.30 PIRCAD retains recall 0.95 against 0.67 (generic forest) and 0.55 (CNN), with the lowest false-drift rate; with the exact process state but white noise (A3) the generic forest is best (0.76 against 0.36 for PIRCAD) and the CNN collapses to zero. No method dominates: each has a different breaking point along the knowledge axis.</w:t>
+        <w:t>Table 6 sweeps the threat hierarchy of Section 3.2 without retraining any model. When the attacker sees the live process only through a delayed surrogate (A0–A2, fidelity up to 0.10), every learned system catches at least 0.98 of the poisoning, and copying the sensor's noise spectrum gains the attacker nothing. Differences between the systems appear only once the surrogate becomes more accurate. At fidelity 0.30 PIRCAD retains recall 0.95 against 0.67 (generic forest) and 0.55 (CNN), with the lowest false-drift rate; with the exact process state but white noise (A3) the generic forest is best (0.76 against 0.36 for PIRCAD) and the CNN collapses to zero. No method dominates: each has a different breaking point along the knowledge axis.</w:t>
       </w:r>
     </w:p>
     <w:p>
@@ -8592,7 +8592,7 @@
         <w:jc w:val="both"/>
       </w:pPr>
       <w:r>
-        <w:t>The coordinated attacker (A5) marks the limit of the method. By forging every physically coupled instrument from one fake temperature, it keeps the instrument-side constraints satisfied; PIRCAD's localisation then attributes the deviation to the process, and the node forwards it with a process alarm (forwarded error 2.5 °C). The alarm is raised, but the forged values are delivered. Defending against A5 requires an instrument the attacker does not control — an independent reference, an actuator-side measurement, or a cryptographically attested channel — which is outside the scope of a single fog node.</w:t>
+        <w:t>The coordinated attacker (A5) marks the limit of the method. By forging every physically coupled instrument from one fake temperature, it keeps the instrument-side constraints satisfied; PIRCAD's localisation then attributes the deviation to the process, and the node forwards it with a process alarm (forwarded error 2.5 °C). The alarm is raised, but the forged values are delivered. Stopping A5 needs at least one instrument outside the attacker's control, such as an independent reference, a measurement on the actuator side, or a channel with cryptographic attestation. A single fog node cannot provide that on its own.</w:t>
       </w:r>
     </w:p>
     <w:p>
@@ -10106,7 +10106,7 @@
         <w:jc w:val="both"/>
       </w:pPr>
       <w:r>
-        <w:t>PIRCAD degrades but does not collapse: its worst condition is sensor noise ×3 at macro-F1 0.712, against 0.477 (set-point 35 °C) for the CNN and 0.288 (sensor noise ×3) for the generic forest, and its mean over all conditions is 0.889 against 0.810 and 0.817. The residual is invariant to most of what changed — the set-point, the ambient and the plant dynamics enter the expectation as well as the measurement — so only shifts that alter the residual itself hurt. Two of those are real weaknesses. Under the strongest noise shift PIRCAD's false-drift rate rises to 0.23, because the noise-signature features that separate a substituted stream from a drifting one are calibrated to the commissioning noise; and an inaccurate process model (mismatch ×6) raises its false-alarm rate to 0.30. PIRCAD's robustness is therefore conditional on a process model of moderate accuracy, which is the price of judging a channel against physics rather than against its own past.</w:t>
+        <w:t>PIRCAD degrades but does not collapse: its worst condition is sensor noise ×3 at macro-F1 0.712, against 0.477 (set-point 35 °C) for the CNN and 0.288 (sensor noise ×3) for the generic forest, and its mean over all conditions is 0.889 against 0.810 and 0.817. Most of these shifts leave the residual untouched, because a new set-point, ambient or plant dynamics changes the expectation and the measurement together. Only shifts that change the residual itself cause harm, and two of them expose genuine weaknesses. With the strongest noise shift the false-drift rate climbs to 0.23: the noise-signature features, which distinguish a substituted stream from a drifting one, were calibrated on the commissioning noise level. And with a poor process model (mismatch ×6) the false-alarm rate reaches 0.30. In short, PIRCAD is only as robust as its process model is accurate; that is the cost of checking a channel against physics instead of against its own history.</w:t>
       </w:r>
     </w:p>
     <w:p>
@@ -10166,7 +10166,7 @@
         <w:rPr>
           <w:sz w:val="19"/>
         </w:rPr>
-        <w:t xml:space="preserve"> Macro-F1 under distribution shift without retraining (mean, 95 % CI). Each data-driven learner has a condition under which it collapses; PIRCAD's worst case is bounded away from them. Mismatch conditions apply to PIRCAD only.</w:t>
+        <w:t xml:space="preserve"> Macro-F1 under distribution shift, with no retraining (mean, 95 % CI). Both data-driven learners break down under at least one condition, while PIRCAD's lowest score stays well above theirs. The model-mismatch conditions only apply to PIRCAD.</w:t>
       </w:r>
     </w:p>
     <w:p>
@@ -10182,7 +10182,7 @@
         <w:jc w:val="both"/>
       </w:pPr>
       <w:r>
-        <w:t>Label accuracy is a proxy. The quantity that matters is whether the system's adaptive elements survive an attack well enough to report the next genuine fault. In each of 120 episodes (20 seeds × 3 attack rates × 2 attackers: A0, and a fidelity-0.30 noise-matched A2), a rate-matched injection biases the internal temperature downwards for 4500 samples; the attacker then withdraws and the heater contactor welds shut, a genuine over-temperature fault. A cloud-side alarm at 34 °C is applied to whatever the fog layer forwards. Each self-calibrating baseline was tuned on benign drift (training seeds) to do its own job well, and a benign-drift arm (60 episodes, no attack) measures that job.</w:t>
+        <w:t>Correct labels are only a means to an end. What really counts is whether, after an attack, the adaptive parts of the system are still sound enough to report the next real fault. In each of 120 episodes (20 seeds × 3 attack rates × 2 attackers: A0, and a fidelity-0.30 noise-matched A2), a rate-matched injection biases the internal temperature downwards for 4500 samples; the attacker then withdraws and the heater contactor welds shut, a genuine over-temperature fault. In the cloud, an alarm fires when the value forwarded by the fog layer passes 34 °C. Each self-calibrating baseline was tuned on benign drift (training seeds) to do its own job well, and a benign-drift arm (60 episodes, no attack) measures that job.</w:t>
       </w:r>
     </w:p>
     <w:p>
@@ -10202,7 +10202,7 @@
         <w:rPr>
           <w:sz w:val="19"/>
         </w:rPr>
-        <w:t xml:space="preserve"> Attack-then-fault (120 episodes) and benign drift (60 episodes). Spurious trip: the forwarded value crossed 34 °C before the fault existed. Premature trip: it crossed after the fault began but ≥ 5 samples before the plant did (over-reading a real excursion; fails safe). Error at crossing: forwarded minus true temperature when the plant truly crossed 34 °C, mean [95 % CI]. The last column is the mean error of the forwarded, corrected value during benign drift.</w:t>
+        <w:t xml:space="preserve"> Attack-then-fault (120 episodes) and benign drift (60 episodes). Spurious trip: the forwarded value crossed 34 °C before the fault existed. Premature trip: the forwarded value crossed during the fault, at least 5 samples ahead of the plant (a real excursion read too high, which errs on the safe side). Error at crossing: forwarded temperature minus true temperature at the moment the plant actually reached 34 °C, mean [95 % CI]. Last column: mean error of the corrected, forwarded value under benign drift.</w:t>
       </w:r>
     </w:p>
     <w:tbl>
@@ -11195,7 +11195,7 @@
         <w:jc w:val="both"/>
       </w:pPr>
       <w:r>
-        <w:t>PIRCAD pays for this protection in drift-correction accuracy: its correction error during benign drift (0.41 °C) is larger than that of the tuned Kalman and Page-Hinkley correctors (0.14 and 0.10 °C), because its correction is rate-limited and is only engaged after the drift verdict. A deployment that faces no adversary should prefer those correctors; one that does should not use them unguarded.</w:t>
+        <w:t>PIRCAD pays for this protection in drift-correction accuracy: its correction error during benign drift (0.41 °C) is larger than that of the tuned Kalman and Page-Hinkley correctors (0.14 and 0.10 °C), because its correction is rate-limited and is only engaged after the drift verdict. Where no attacker is expected, those correctors are the better choice; where one is, they should not run without a guard.</w:t>
       </w:r>
     </w:p>
     <w:p>
@@ -11255,7 +11255,7 @@
         <w:rPr>
           <w:sz w:val="19"/>
         </w:rPr>
-        <w:t xml:space="preserve"> Safety under adaptation poisoning. (a) Fraction of episodes in which the cloud-side 34 °C alarm fired for the genuine fault; (b) forwarded minus true temperature at the true crossing (negative = under-report, the dangerous direction); (c) correction error during benign drift. Means with 95 % CIs.</w:t>
+        <w:t xml:space="preserve"> Effect of poisoning the adaptation on the safety alarm. (a) Share of episodes in which the cloud-side 34 °C alarm fired for the genuine fault; (b) forwarded minus true temperature at the true crossing (negative = under-report, the dangerous direction); (c) correction error during benign drift. Means with 95 % CIs.</w:t>
       </w:r>
     </w:p>
     <w:p>
@@ -11283,7 +11283,7 @@
         <w:rPr>
           <w:sz w:val="19"/>
         </w:rPr>
-        <w:t xml:space="preserve"> Intel Lab, 26 held-out motes × 6 scenarios × 2 replicates (312 episodes); models fitted on 25 disjoint train motes. Mean [95 % CI]; p: paired Wilcoxon on macro-F1 vs. PIRCAD (random forest), Holm-corrected. Harm: mean forwarded error on the injected channel (°C).</w:t>
+        <w:t xml:space="preserve"> Intel Lab results: 312 test episodes (26 held-out motes, 6 scenarios, 2 replicates each), with all models trained on a separate set of 25 motes. Mean [95 % CI]; p: paired Wilcoxon on macro-F1 vs. PIRCAD (random forest), Holm-corrected. Harm: mean forwarded error on the injected channel (°C).</w:t>
       </w:r>
     </w:p>
     <w:tbl>
@@ -14833,7 +14833,7 @@
         <w:jc w:val="both"/>
       </w:pPr>
       <w:r>
-        <w:t>Two results contradict hypotheses that motivated our initial design. Replacing the dedicated observers by one shared closed-loop estimator does not significantly change macro-F1 (0.930, p = 0.54) once the classifier is retrained on the changed features: the bias is attenuated in a shared estimator's residual, but the trigger and the remaining features still see it. And removing the cross-sensor localisation leaves macro-F1 unchanged (0.937, p = 0.68); in this plant the residual character alone suffices to recognise the process event. We therefore do not claim either element as necessary for classification in distribution. The leave-one-out structure is kept because Proposition 2 requires an expectation that excludes the channel; in this plant a shared estimator happens to draw most of its weight from the other instruments, so the difference is small here but is not guaranteed in general.</w:t>
+        <w:t>Two results contradict hypotheses that motivated our initial design. Replacing the dedicated observers by one shared closed-loop estimator does not significantly change macro-F1 (0.930, p = 0.54) once the classifier is retrained on the changed features: the bias is attenuated in a shared estimator's residual, but the trigger and the remaining features still see it. Dropping the cross-sensor localisation also leaves macro-F1 where it was (0.937, p = 0.68), because in this plant the character of the residual is enough to spot the process event. Neither element, then, is needed for in-distribution classification, and we do not claim otherwise. We keep the leave-one-out design because Proposition 2 depends on an expectation that leaves the channel out. Here a shared estimator happens to rely mostly on the other instruments, which is why the gap is small; that will not hold for every plant.</w:t>
       </w:r>
     </w:p>
     <w:p>
@@ -14841,7 +14841,7 @@
         <w:jc w:val="both"/>
       </w:pPr>
       <w:r>
-        <w:t>The two governance rows act on effect, not on labels, which is why a label-only ablation would rank them as worthless. Without the adaptation governor, macro-F1 is unchanged but retraining protection falls from 0.998 to 0.000: every poisoned sample reaches an adaptive element. Without the differential response, containment falls from 0.973 to 0.000 and process masking rises from 0.017 to 0.315.</w:t>
+        <w:t>The two governance elements change what the system does, not the labels it assigns, so judging them by label accuracy alone would make them look useless. Remove the adaptation governor and macro-F1 stays the same, but retraining protection drops from 0.998 to 0.000, meaning every poisoned sample reaches an adaptive element. Remove the differential response and containment drops from 0.973 to 0.000 and process masking rises from 0.017 to 0.315.</w:t>
       </w:r>
     </w:p>
     <w:p>
@@ -14861,7 +14861,7 @@
         <w:rPr>
           <w:sz w:val="19"/>
         </w:rPr>
-        <w:t xml:space="preserve"> Physics features, generic features, and both in one learner (macro-F1). The combined learner keeps PIRCAD's governance and response.</w:t>
+        <w:t xml:space="preserve"> Macro-F1 with physics features only, generic features only, and the two combined in a single learner. The combined learner uses PIRCAD's governance and response unchanged.</w:t>
       </w:r>
     </w:p>
     <w:tbl>
@@ -15381,7 +15381,7 @@
         <w:jc w:val="both"/>
       </w:pPr>
       <w:r>
-        <w:t>Table 12 asks whether the two feature families are complementary. In distribution the combined learner reaches 0.976, closing the gap to the generic forest; under the strongest noise shift it reaches 0.525, so it inherits the fragility of the generic features. Adding data-driven features to a physics-anchored learner is therefore a trade-off along the same axis as the comparison itself, not a free improvement.</w:t>
+        <w:t>Table 12 tests whether the two kinds of feature complement each other. On the nominal bank the combined learner scores 0.976, closing the gap to the generic forest; but with the strongest noise shift it falls to 0.525, so it inherits the fragility of the generic features. Mixing data-driven features into a physics-anchored learner thus buys in-distribution accuracy at the price of robustness, the same trade-off seen in the main comparison, rather than giving a gain for free.</w:t>
       </w:r>
     </w:p>
     <w:p>
@@ -15441,7 +15441,7 @@
         <w:rPr>
           <w:sz w:val="19"/>
         </w:rPr>
-        <w:t xml:space="preserve"> Ablation (mean, 95 % CI). (a) Macro-F1; (b) forwarded error on the target channel. The dotted line marks the full system.</w:t>
+        <w:t xml:space="preserve"> Results of removing one element at a time (mean, 95 % CI): (a) macro-F1 and (b) forwarded error on the target channel. The dotted line shows the complete system.</w:t>
       </w:r>
     </w:p>
     <w:p>
@@ -15506,7 +15506,7 @@
         <w:t>not</w:t>
       </w:r>
       <w:r>
-        <w:t xml:space="preserve"> a more accurate classifier than a strong data-driven learner trained on the same distribution: in simulation the CNN and the generic forest match or beat it, and on real data they beat it clearly. What a physics-anchored, cause-aware learner offers is different in kind:</w:t>
+        <w:t xml:space="preserve"> a more accurate classifier than a strong data-driven learner trained on the same distribution: in simulation the CNN and the generic forest match or beat it, and on real data they beat it clearly. Its advantages lie elsewhere:</w:t>
       </w:r>
     </w:p>
     <w:p>
@@ -15522,7 +15522,7 @@
         <w:t>Bounded worst case under shift — in simulation.</w:t>
       </w:r>
       <w:r>
-        <w:t xml:space="preserve"> Every data-driven learner had a simulated shift under which it collapsed (worst macro-F1 0.29 and 0.48); PIRCAD's worst case was 0.71, provided its process model is reasonably accurate. On the real deployment the CNN was unaffected by the noise shift we could apply, so this advantage is not yet established on real data.</w:t>
+        <w:t xml:space="preserve"> In simulation, each data-driven learner failed badly under some shift (lowest macro-F1 0.29 and 0.48), whereas PIRCAD never fell below 0.71 as long as its process model was reasonably good. On the real deployment, however, the noise shift we could apply did not affect the CNN, so this advantage still has to be shown on real data.</w:t>
       </w:r>
     </w:p>
     <w:p>
@@ -15538,7 +15538,7 @@
         <w:t>The ability to act on a verdict.</w:t>
       </w:r>
       <w:r>
-        <w:t xml:space="preserve"> Correcting a drifting sensor requires an estimate of its bias against something it cannot influence. A label-only system can only withhold what it flags; on benign drift PIRCAD delivered 99 % of the channel within tolerance against 4 % for the learned baselines in simulation, and 35 % against 7 % on real data.</w:t>
+        <w:t xml:space="preserve"> To correct a drifting sensor, you need an estimate of its bias taken against a reference the sensor cannot affect. A label-only system can only withhold what it flags; on benign drift PIRCAD delivered 99 % of the channel within tolerance against 4 % for the learned baselines in simulation, and 35 % against 7 % on real data.</w:t>
       </w:r>
     </w:p>
     <w:p>
@@ -15651,7 +15651,7 @@
         <w:t>Irreversible action on uncertain verdicts.</w:t>
       </w:r>
       <w:r>
-        <w:t xml:space="preserve"> With no escalation back-end the fallback forced an uncertain verdict to full confidence, so a 0.3-confidence poisoning guess latched quarantine. On real data this turned a classifier that mostly called drift correctly into one that reported poisoning for most of each drift episode. Uncertain poisoning verdicts now hold the sample without latching.</w:t>
+        <w:t xml:space="preserve"> With no escalation back-end the fallback forced an uncertain verdict to full confidence, so a 0.3-confidence poisoning guess latched quarantine. On real data this turned a classifier that mostly called drift correctly into one that reported poisoning for most of each drift episode. Now, a poisoning verdict with low confidence only holds back that sample and does not trigger a latched quarantine.</w:t>
       </w:r>
     </w:p>
     <w:p>

</xml_diff>